<commit_message>
Update Author attribution to Kirubai (Kirubai Technologies)
</commit_message>
<xml_diff>
--- a/ESP32_Automated_Coal_Transport_System_Technical_Report.docx
+++ b/ESP32_Automated_Coal_Transport_System_Technical_Report.docx
@@ -19,7 +19,7 @@
     </w:p>
     <w:p>
       <w:pPr>
-        <w:spacing w:before="0" w:after="400"/>
+        <w:spacing w:before="0" w:after="280"/>
         <w:jc w:val="center"/>
       </w:pPr>
       <w:r>
@@ -30,6 +30,36 @@
           <w:sz w:val="26"/>
         </w:rPr>
         <w:t>Comprehensive Technical Design, Firmware Architecture, State Machine Algorithms &amp; Web Telemetry Specification</w:t>
+      </w:r>
+    </w:p>
+    <w:p>
+      <w:pPr>
+        <w:spacing w:before="0" w:after="120"/>
+        <w:jc w:val="center"/>
+      </w:pPr>
+      <w:r>
+        <w:rPr>
+          <w:b/>
+          <w:color w:val="1E3A8A"/>
+          <w:sz w:val="24"/>
+        </w:rPr>
+        <w:t xml:space="preserve">Author: </w:t>
+      </w:r>
+      <w:r>
+        <w:rPr>
+          <w:b/>
+          <w:color w:val="2563EB"/>
+          <w:sz w:val="24"/>
+        </w:rPr>
+        <w:t>Kirubai</w:t>
+      </w:r>
+      <w:r>
+        <w:rPr>
+          <w:i/>
+          <w:color w:val="4B5563"/>
+          <w:sz w:val="22"/>
+        </w:rPr>
+        <w:t xml:space="preserve"> (Kirubai Technologies)</w:t>
       </w:r>
     </w:p>
     <w:p>

</xml_diff>